<commit_message>
Add six separate customer and internal SOPs for AWS, GCP, and Azure
</commit_message>
<xml_diff>
--- a/SOP-GCP-AUDIT-INTERNAL-v1.0.docx
+++ b/SOP-GCP-AUDIT-INTERNAL-v1.0.docx
@@ -9,7 +9,7 @@
           <w:b/>
           <w:sz w:val="36"/>
         </w:rPr>
-        <w:t>GCP Prowler Audit Execution Guide (Internal Use)</w:t>
+        <w:t>GCP Cloud Security Assessment: Prowler Audit Execution Guide</w:t>
       </w:r>
     </w:p>
     <w:p>
@@ -19,7 +19,7 @@
           <w:i/>
           <w:sz w:val="19"/>
         </w:rPr>
-        <w:t>Document ID: SOP-GCP-PROWLER-AUDIT  |  Date: July 10, 2026  |  Version: 1.0</w:t>
+        <w:t>Document ID: SOP-GCP-AUDIT-INTERNAL  |  Date: July 10, 2026  |  Version: 1.0</w:t>
         <w:br/>
       </w:r>
     </w:p>
@@ -47,7 +47,20 @@
           <w:i w:val="0"/>
           <w:sz w:val="20"/>
         </w:rPr>
-        <w:t>This guide shows how to run security assessments on GCP using Prowler, configure filters, and view reports.</w:t>
+        <w:t>This guide details how to execute security scans on GCP using Prowler CLI and deploy the Prowler Web App using Docker Compose.</w:t>
+      </w:r>
+    </w:p>
+    <w:p>
+      <w:pPr>
+        <w:pStyle w:val="Heading1"/>
+      </w:pPr>
+      <w:r>
+        <w:rPr>
+          <w:rFonts w:ascii="Arial" w:hAnsi="Arial"/>
+          <w:b/>
+          <w:sz w:val="28"/>
+        </w:rPr>
+        <w:t>2. Running Scans via Prowler CLI</w:t>
       </w:r>
     </w:p>
     <w:p>
@@ -61,7 +74,24 @@
           <w:i w:val="0"/>
           <w:sz w:val="20"/>
         </w:rPr>
-        <w:t>Use the credentials file provided by the customer (e.g. security-audit-key.json).</w:t>
+        <w:t>Import the customer's shared 'security-audit-key.json' file and run:</w:t>
+      </w:r>
+    </w:p>
+    <w:p>
+      <w:pPr>
+        <w:spacing w:before="80" w:after="80"/>
+        <w:ind w:left="360"/>
+      </w:pPr>
+      <w:r>
+        <w:rPr>
+          <w:rFonts w:ascii="Courier New" w:hAnsi="Courier New"/>
+          <w:sz w:val="18"/>
+        </w:rPr>
+        <w:t>export GOOGLE_APPLICATION_CREDENTIALS="/path/to/security-audit-key.json"</w:t>
+        <w:br/>
+        <w:t>export GOOGLE_CLOUD_QUOTA_PROJECT="&lt;CUSTOMER_PROJECT_ID&gt;"</w:t>
+        <w:br/>
+        <w:t>prowler gcp</w:t>
       </w:r>
     </w:p>
     <w:p>
@@ -74,7 +104,7 @@
           <w:b/>
           <w:sz w:val="28"/>
         </w:rPr>
-        <w:t>2. Configure Authentication</w:t>
+        <w:t>3. Setting up the Prowler Web App</w:t>
       </w:r>
     </w:p>
     <w:p>
@@ -88,7 +118,76 @@
           <w:i w:val="0"/>
           <w:sz w:val="20"/>
         </w:rPr>
-        <w:t>Point Prowler to the customer's shared credentials key file:</w:t>
+        <w:t>Download the Docker configuration files:</w:t>
+      </w:r>
+    </w:p>
+    <w:p>
+      <w:pPr>
+        <w:spacing w:before="80" w:after="80"/>
+        <w:ind w:left="360"/>
+      </w:pPr>
+      <w:r>
+        <w:rPr>
+          <w:rFonts w:ascii="Courier New" w:hAnsi="Courier New"/>
+          <w:sz w:val="18"/>
+        </w:rPr>
+        <w:t>curl -LO https://raw.githubusercontent.com/prowler-cloud/prowler/refs/heads/master/docker-compose.yml</w:t>
+        <w:br/>
+        <w:t>curl -LO https://raw.githubusercontent.com/prowler-cloud/prowler/refs/heads/master/.env</w:t>
+      </w:r>
+    </w:p>
+    <w:p>
+      <w:pPr>
+        <w:spacing w:before="120" w:after="40"/>
+        <w:jc w:val="center"/>
+      </w:pPr>
+      <w:r>
+        <w:drawing>
+          <wp:inline xmlns:a="http://schemas.openxmlformats.org/drawingml/2006/main" xmlns:pic="http://schemas.openxmlformats.org/drawingml/2006/picture">
+            <wp:extent cx="4572000" cy="2583656"/>
+            <wp:docPr id="1" name="Picture 1"/>
+            <wp:cNvGraphicFramePr>
+              <a:graphicFrameLocks noChangeAspect="1"/>
+            </wp:cNvGraphicFramePr>
+            <a:graphic>
+              <a:graphicData uri="http://schemas.openxmlformats.org/drawingml/2006/picture">
+                <pic:pic>
+                  <pic:nvPicPr>
+                    <pic:cNvPr id="0" name="prowler-env-file.jpg"/>
+                    <pic:cNvPicPr/>
+                  </pic:nvPicPr>
+                  <pic:blipFill>
+                    <a:blip r:embed="rId9"/>
+                    <a:stretch>
+                      <a:fillRect/>
+                    </a:stretch>
+                  </pic:blipFill>
+                  <pic:spPr>
+                    <a:xfrm>
+                      <a:off x="0" y="0"/>
+                      <a:ext cx="4572000" cy="2583656"/>
+                    </a:xfrm>
+                    <a:prstGeom prst="rect"/>
+                  </pic:spPr>
+                </pic:pic>
+              </a:graphicData>
+            </a:graphic>
+          </wp:inline>
+        </w:drawing>
+      </w:r>
+    </w:p>
+    <w:p>
+      <w:pPr>
+        <w:spacing w:after="160"/>
+        <w:jc w:val="center"/>
+      </w:pPr>
+      <w:r>
+        <w:rPr>
+          <w:rFonts w:ascii="Arial" w:hAnsi="Arial"/>
+          <w:i/>
+          <w:sz w:val="17"/>
+        </w:rPr>
+        <w:t>Figure: Prowler environment config showing port settings and environment options</w:t>
       </w:r>
     </w:p>
     <w:p>
@@ -102,7 +201,7 @@
           <w:i w:val="0"/>
           <w:sz w:val="20"/>
         </w:rPr>
-        <w:t>On Linux/macOS:</w:t>
+        <w:t>Spin up the Docker containers in detached mode:</w:t>
       </w:r>
     </w:p>
     <w:p>
@@ -115,9 +214,7 @@
           <w:rFonts w:ascii="Courier New" w:hAnsi="Courier New"/>
           <w:sz w:val="18"/>
         </w:rPr>
-        <w:t>export GOOGLE_APPLICATION_CREDENTIALS="/absolute/path/to/security-audit-key.json"</w:t>
-        <w:br/>
-        <w:t>export GOOGLE_CLOUD_QUOTA_PROJECT="&lt;CUSTOMER_PROJECT_ID&gt;"</w:t>
+        <w:t>sudo docker compose up -d</w:t>
       </w:r>
     </w:p>
     <w:p>
@@ -131,22 +228,61 @@
           <w:i w:val="0"/>
           <w:sz w:val="20"/>
         </w:rPr>
-        <w:t>On Windows (PowerShell):</w:t>
+        <w:t>Open browser to http://localhost:3000. Under 'Cloud Providers', select GCP and upload the JSON credentials:</w:t>
       </w:r>
     </w:p>
     <w:p>
       <w:pPr>
-        <w:spacing w:before="80" w:after="80"/>
-        <w:ind w:left="360"/>
+        <w:spacing w:before="120" w:after="40"/>
+        <w:jc w:val="center"/>
+      </w:pPr>
+      <w:r>
+        <w:drawing>
+          <wp:inline xmlns:a="http://schemas.openxmlformats.org/drawingml/2006/main" xmlns:pic="http://schemas.openxmlformats.org/drawingml/2006/picture">
+            <wp:extent cx="4572000" cy="2184914"/>
+            <wp:docPr id="2" name="Picture 2"/>
+            <wp:cNvGraphicFramePr>
+              <a:graphicFrameLocks noChangeAspect="1"/>
+            </wp:cNvGraphicFramePr>
+            <a:graphic>
+              <a:graphicData uri="http://schemas.openxmlformats.org/drawingml/2006/picture">
+                <pic:pic>
+                  <pic:nvPicPr>
+                    <pic:cNvPr id="0" name="prowler-app-dashboard.jpg"/>
+                    <pic:cNvPicPr/>
+                  </pic:nvPicPr>
+                  <pic:blipFill>
+                    <a:blip r:embed="rId10"/>
+                    <a:stretch>
+                      <a:fillRect/>
+                    </a:stretch>
+                  </pic:blipFill>
+                  <pic:spPr>
+                    <a:xfrm>
+                      <a:off x="0" y="0"/>
+                      <a:ext cx="4572000" cy="2184914"/>
+                    </a:xfrm>
+                    <a:prstGeom prst="rect"/>
+                  </pic:spPr>
+                </pic:pic>
+              </a:graphicData>
+            </a:graphic>
+          </wp:inline>
+        </w:drawing>
+      </w:r>
+    </w:p>
+    <w:p>
+      <w:pPr>
+        <w:spacing w:after="160"/>
+        <w:jc w:val="center"/>
       </w:pPr>
       <w:r>
         <w:rPr>
-          <w:rFonts w:ascii="Courier New" w:hAnsi="Courier New"/>
-          <w:sz w:val="18"/>
+          <w:rFonts w:ascii="Arial" w:hAnsi="Arial"/>
+          <w:i/>
+          <w:sz w:val="17"/>
         </w:rPr>
-        <w:t>$env:GOOGLE_APPLICATION_CREDENTIALS = "C:\path\to\security-audit-key.json"</w:t>
-        <w:br/>
-        <w:t>$env:GOOGLE_CLOUD_QUOTA_PROJECT = "&lt;CUSTOMER_PROJECT_ID&gt;"</w:t>
+        <w:t>Figure: Prowler App main login/providers page</w:t>
       </w:r>
     </w:p>
     <w:p>
@@ -159,7 +295,7 @@
           <w:b/>
           <w:sz w:val="28"/>
         </w:rPr>
-        <w:t>3. Running the Audit</w:t>
+        <w:t>4. Prowler App Web UI Views</w:t>
       </w:r>
     </w:p>
     <w:p>
@@ -173,597 +309,115 @@
           <w:i w:val="0"/>
           <w:sz w:val="20"/>
         </w:rPr>
-        <w:t>With your environment variables set, execute Prowler using the following command:</w:t>
+        <w:t>Once the scan is complete, view the dashboards and compliance results:</w:t>
       </w:r>
     </w:p>
     <w:p>
       <w:pPr>
-        <w:spacing w:before="80" w:after="80"/>
-        <w:ind w:left="360"/>
+        <w:spacing w:before="120" w:after="40"/>
+        <w:jc w:val="center"/>
       </w:pPr>
       <w:r>
-        <w:rPr>
-          <w:rFonts w:ascii="Courier New" w:hAnsi="Courier New"/>
-          <w:sz w:val="18"/>
-        </w:rPr>
-        <w:t>prowler gcp</w:t>
+        <w:drawing>
+          <wp:inline xmlns:a="http://schemas.openxmlformats.org/drawingml/2006/main" xmlns:pic="http://schemas.openxmlformats.org/drawingml/2006/picture">
+            <wp:extent cx="4572000" cy="3315891"/>
+            <wp:docPr id="3" name="Picture 3"/>
+            <wp:cNvGraphicFramePr>
+              <a:graphicFrameLocks noChangeAspect="1"/>
+            </wp:cNvGraphicFramePr>
+            <a:graphic>
+              <a:graphicData uri="http://schemas.openxmlformats.org/drawingml/2006/picture">
+                <pic:pic>
+                  <pic:nvPicPr>
+                    <pic:cNvPr id="0" name="prowler-dashboard-web.jpg"/>
+                    <pic:cNvPicPr/>
+                  </pic:nvPicPr>
+                  <pic:blipFill>
+                    <a:blip r:embed="rId11"/>
+                    <a:stretch>
+                      <a:fillRect/>
+                    </a:stretch>
+                  </pic:blipFill>
+                  <pic:spPr>
+                    <a:xfrm>
+                      <a:off x="0" y="0"/>
+                      <a:ext cx="4572000" cy="3315891"/>
+                    </a:xfrm>
+                    <a:prstGeom prst="rect"/>
+                  </pic:spPr>
+                </pic:pic>
+              </a:graphicData>
+            </a:graphic>
+          </wp:inline>
+        </w:drawing>
       </w:r>
     </w:p>
     <w:p>
       <w:pPr>
-        <w:pStyle w:val="Heading1"/>
+        <w:spacing w:after="160"/>
+        <w:jc w:val="center"/>
       </w:pPr>
       <w:r>
         <w:rPr>
           <w:rFonts w:ascii="Arial" w:hAnsi="Arial"/>
-          <w:b/>
-          <w:sz w:val="28"/>
+          <w:i/>
+          <w:sz w:val="17"/>
         </w:rPr>
-        <w:t>4. Common Filter Options</w:t>
+        <w:t>Figure: Interactive Prowler App Dashboard UI</w:t>
       </w:r>
     </w:p>
     <w:p>
       <w:pPr>
-        <w:spacing w:after="120"/>
+        <w:spacing w:before="120" w:after="40"/>
+        <w:jc w:val="center"/>
+      </w:pPr>
+      <w:r>
+        <w:drawing>
+          <wp:inline xmlns:a="http://schemas.openxmlformats.org/drawingml/2006/main" xmlns:pic="http://schemas.openxmlformats.org/drawingml/2006/picture">
+            <wp:extent cx="4572000" cy="2126512"/>
+            <wp:docPr id="4" name="Picture 4"/>
+            <wp:cNvGraphicFramePr>
+              <a:graphicFrameLocks noChangeAspect="1"/>
+            </wp:cNvGraphicFramePr>
+            <a:graphic>
+              <a:graphicData uri="http://schemas.openxmlformats.org/drawingml/2006/picture">
+                <pic:pic>
+                  <pic:nvPicPr>
+                    <pic:cNvPr id="0" name="compliance-dashboard.jpg"/>
+                    <pic:cNvPicPr/>
+                  </pic:nvPicPr>
+                  <pic:blipFill>
+                    <a:blip r:embed="rId12"/>
+                    <a:stretch>
+                      <a:fillRect/>
+                    </a:stretch>
+                  </pic:blipFill>
+                  <pic:spPr>
+                    <a:xfrm>
+                      <a:off x="0" y="0"/>
+                      <a:ext cx="4572000" cy="2126512"/>
+                    </a:xfrm>
+                    <a:prstGeom prst="rect"/>
+                  </pic:spPr>
+                </pic:pic>
+              </a:graphicData>
+            </a:graphic>
+          </wp:inline>
+        </w:drawing>
+      </w:r>
+    </w:p>
+    <w:p>
+      <w:pPr>
+        <w:spacing w:after="160"/>
+        <w:jc w:val="center"/>
       </w:pPr>
       <w:r>
         <w:rPr>
           <w:rFonts w:ascii="Arial" w:hAnsi="Arial"/>
-          <w:b w:val="0"/>
-          <w:i w:val="0"/>
-          <w:sz w:val="20"/>
+          <w:i/>
+          <w:sz w:val="17"/>
         </w:rPr>
-        <w:t>You can customize the audit using these command flags:</w:t>
-      </w:r>
-    </w:p>
-    <w:p>
-      <w:pPr>
-        <w:spacing w:after="120"/>
-      </w:pPr>
-      <w:r>
-        <w:rPr>
-          <w:rFonts w:ascii="Arial" w:hAnsi="Arial"/>
-          <w:b/>
-          <w:i w:val="0"/>
-          <w:sz w:val="20"/>
-        </w:rPr>
-        <w:t>Scan specific projects:</w:t>
-      </w:r>
-    </w:p>
-    <w:p>
-      <w:pPr>
-        <w:spacing w:before="80" w:after="80"/>
-        <w:ind w:left="360"/>
-      </w:pPr>
-      <w:r>
-        <w:rPr>
-          <w:rFonts w:ascii="Courier New" w:hAnsi="Courier New"/>
-          <w:sz w:val="18"/>
-        </w:rPr>
-        <w:t>prowler gcp --project-ids &lt;CUSTOMER_PROJECT_ID&gt;</w:t>
-      </w:r>
-    </w:p>
-    <w:p>
-      <w:pPr>
-        <w:spacing w:after="120"/>
-      </w:pPr>
-      <w:r>
-        <w:rPr>
-          <w:rFonts w:ascii="Arial" w:hAnsi="Arial"/>
-          <w:b/>
-          <w:i w:val="0"/>
-          <w:sz w:val="20"/>
-        </w:rPr>
-        <w:t>Scan specific services only (e.g. storage and iam):</w:t>
-      </w:r>
-    </w:p>
-    <w:p>
-      <w:pPr>
-        <w:spacing w:before="80" w:after="80"/>
-        <w:ind w:left="360"/>
-      </w:pPr>
-      <w:r>
-        <w:rPr>
-          <w:rFonts w:ascii="Courier New" w:hAnsi="Courier New"/>
-          <w:sz w:val="18"/>
-        </w:rPr>
-        <w:t>prowler gcp --services storage iam</w:t>
-      </w:r>
-    </w:p>
-    <w:p>
-      <w:pPr>
-        <w:spacing w:after="120"/>
-      </w:pPr>
-      <w:r>
-        <w:rPr>
-          <w:rFonts w:ascii="Arial" w:hAnsi="Arial"/>
-          <w:b/>
-          <w:i w:val="0"/>
-          <w:sz w:val="20"/>
-        </w:rPr>
-        <w:t>Filter by severity (e.g. only show critical and high findings):</w:t>
-      </w:r>
-    </w:p>
-    <w:p>
-      <w:pPr>
-        <w:spacing w:before="80" w:after="80"/>
-        <w:ind w:left="360"/>
-      </w:pPr>
-      <w:r>
-        <w:rPr>
-          <w:rFonts w:ascii="Courier New" w:hAnsi="Courier New"/>
-          <w:sz w:val="18"/>
-        </w:rPr>
-        <w:t>prowler gcp --severity critical high</w:t>
-      </w:r>
-    </w:p>
-    <w:p>
-      <w:pPr>
-        <w:pStyle w:val="Heading1"/>
-      </w:pPr>
-      <w:r>
-        <w:rPr>
-          <w:rFonts w:ascii="Arial" w:hAnsi="Arial"/>
-          <w:b/>
-          <w:sz w:val="28"/>
-        </w:rPr>
-        <w:t>5. Running Compliance Scans</w:t>
-      </w:r>
-    </w:p>
-    <w:p>
-      <w:pPr>
-        <w:spacing w:after="120"/>
-      </w:pPr>
-      <w:r>
-        <w:rPr>
-          <w:rFonts w:ascii="Arial" w:hAnsi="Arial"/>
-          <w:b w:val="0"/>
-          <w:i w:val="0"/>
-          <w:sz w:val="20"/>
-        </w:rPr>
-        <w:t>To check compliance against standard security frameworks, use the --compliance flag:</w:t>
-      </w:r>
-    </w:p>
-    <w:p>
-      <w:pPr>
-        <w:spacing w:after="120"/>
-      </w:pPr>
-      <w:r>
-        <w:rPr>
-          <w:rFonts w:ascii="Arial" w:hAnsi="Arial"/>
-          <w:b/>
-          <w:i w:val="0"/>
-          <w:sz w:val="20"/>
-        </w:rPr>
-        <w:t>CIS GCP Foundations Benchmark:</w:t>
-      </w:r>
-    </w:p>
-    <w:p>
-      <w:pPr>
-        <w:spacing w:before="80" w:after="80"/>
-        <w:ind w:left="360"/>
-      </w:pPr>
-      <w:r>
-        <w:rPr>
-          <w:rFonts w:ascii="Courier New" w:hAnsi="Courier New"/>
-          <w:sz w:val="18"/>
-        </w:rPr>
-        <w:t>prowler gcp --compliance cis_2.0_gcp</w:t>
-      </w:r>
-    </w:p>
-    <w:p>
-      <w:pPr>
-        <w:spacing w:after="120"/>
-      </w:pPr>
-      <w:r>
-        <w:rPr>
-          <w:rFonts w:ascii="Arial" w:hAnsi="Arial"/>
-          <w:b/>
-          <w:i w:val="0"/>
-          <w:sz w:val="20"/>
-        </w:rPr>
-        <w:t>Other available frameworks:</w:t>
-      </w:r>
-    </w:p>
-    <w:tbl>
-      <w:tblPr>
-        <w:tblW w:type="auto" w:w="0"/>
-        <w:tblLayout w:type="autofit"/>
-        <w:tblLook w:firstColumn="1" w:firstRow="1" w:lastColumn="0" w:lastRow="0" w:noHBand="0" w:noVBand="1" w:val="04A0"/>
-      </w:tblPr>
-      <w:tblGrid>
-        <w:gridCol w:w="4320"/>
-        <w:gridCol w:w="4320"/>
-      </w:tblGrid>
-      <w:tr>
-        <w:tc>
-          <w:tcPr>
-            <w:tcW w:type="dxa" w:w="4320"/>
-          </w:tcPr>
-          <w:p>
-            <w:pPr>
-              <w:spacing w:after="80"/>
-            </w:pPr>
-            <w:r/>
-            <w:r>
-              <w:rPr>
-                <w:rFonts w:ascii="Arial" w:hAnsi="Arial"/>
-                <w:b/>
-                <w:sz w:val="19"/>
-              </w:rPr>
-              <w:t>Framework Name</w:t>
-            </w:r>
-          </w:p>
-        </w:tc>
-        <w:tc>
-          <w:tcPr>
-            <w:tcW w:type="dxa" w:w="4320"/>
-          </w:tcPr>
-          <w:p>
-            <w:pPr>
-              <w:spacing w:after="80"/>
-            </w:pPr>
-            <w:r/>
-            <w:r>
-              <w:rPr>
-                <w:rFonts w:ascii="Arial" w:hAnsi="Arial"/>
-                <w:b/>
-                <w:sz w:val="19"/>
-              </w:rPr>
-              <w:t>Prowler Identifier</w:t>
-            </w:r>
-          </w:p>
-        </w:tc>
-      </w:tr>
-      <w:tr>
-        <w:tc>
-          <w:tcPr>
-            <w:tcW w:type="dxa" w:w="4320"/>
-          </w:tcPr>
-          <w:p>
-            <w:pPr>
-              <w:spacing w:after="80"/>
-            </w:pPr>
-            <w:r/>
-            <w:r>
-              <w:rPr>
-                <w:rFonts w:ascii="Arial" w:hAnsi="Arial"/>
-                <w:sz w:val="18"/>
-              </w:rPr>
-              <w:t>CIS GCP Foundations v3.0</w:t>
-            </w:r>
-          </w:p>
-        </w:tc>
-        <w:tc>
-          <w:tcPr>
-            <w:tcW w:type="dxa" w:w="4320"/>
-          </w:tcPr>
-          <w:p>
-            <w:pPr>
-              <w:spacing w:after="80"/>
-            </w:pPr>
-            <w:r/>
-            <w:r>
-              <w:rPr>
-                <w:rFonts w:ascii="Arial" w:hAnsi="Arial"/>
-                <w:sz w:val="18"/>
-              </w:rPr>
-              <w:t>cis_3.0_gcp</w:t>
-            </w:r>
-          </w:p>
-        </w:tc>
-      </w:tr>
-      <w:tr>
-        <w:tc>
-          <w:tcPr>
-            <w:tcW w:type="dxa" w:w="4320"/>
-          </w:tcPr>
-          <w:p>
-            <w:pPr>
-              <w:spacing w:after="80"/>
-            </w:pPr>
-            <w:r/>
-            <w:r>
-              <w:rPr>
-                <w:rFonts w:ascii="Arial" w:hAnsi="Arial"/>
-                <w:sz w:val="18"/>
-              </w:rPr>
-              <w:t>NIST 800-53</w:t>
-            </w:r>
-          </w:p>
-        </w:tc>
-        <w:tc>
-          <w:tcPr>
-            <w:tcW w:type="dxa" w:w="4320"/>
-          </w:tcPr>
-          <w:p>
-            <w:pPr>
-              <w:spacing w:after="80"/>
-            </w:pPr>
-            <w:r/>
-            <w:r>
-              <w:rPr>
-                <w:rFonts w:ascii="Arial" w:hAnsi="Arial"/>
-                <w:sz w:val="18"/>
-              </w:rPr>
-              <w:t>nist_800_53_revision_5_gcp</w:t>
-            </w:r>
-          </w:p>
-        </w:tc>
-      </w:tr>
-      <w:tr>
-        <w:tc>
-          <w:tcPr>
-            <w:tcW w:type="dxa" w:w="4320"/>
-          </w:tcPr>
-          <w:p>
-            <w:pPr>
-              <w:spacing w:after="80"/>
-            </w:pPr>
-            <w:r/>
-            <w:r>
-              <w:rPr>
-                <w:rFonts w:ascii="Arial" w:hAnsi="Arial"/>
-                <w:sz w:val="18"/>
-              </w:rPr>
-              <w:t>PCI-DSS v4.0</w:t>
-            </w:r>
-          </w:p>
-        </w:tc>
-        <w:tc>
-          <w:tcPr>
-            <w:tcW w:type="dxa" w:w="4320"/>
-          </w:tcPr>
-          <w:p>
-            <w:pPr>
-              <w:spacing w:after="80"/>
-            </w:pPr>
-            <w:r/>
-            <w:r>
-              <w:rPr>
-                <w:rFonts w:ascii="Arial" w:hAnsi="Arial"/>
-                <w:sz w:val="18"/>
-              </w:rPr>
-              <w:t>pci_4.0_gcp</w:t>
-            </w:r>
-          </w:p>
-        </w:tc>
-      </w:tr>
-      <w:tr>
-        <w:tc>
-          <w:tcPr>
-            <w:tcW w:type="dxa" w:w="4320"/>
-          </w:tcPr>
-          <w:p>
-            <w:pPr>
-              <w:spacing w:after="80"/>
-            </w:pPr>
-            <w:r/>
-            <w:r>
-              <w:rPr>
-                <w:rFonts w:ascii="Arial" w:hAnsi="Arial"/>
-                <w:sz w:val="18"/>
-              </w:rPr>
-              <w:t>SOC 2</w:t>
-            </w:r>
-          </w:p>
-        </w:tc>
-        <w:tc>
-          <w:tcPr>
-            <w:tcW w:type="dxa" w:w="4320"/>
-          </w:tcPr>
-          <w:p>
-            <w:pPr>
-              <w:spacing w:after="80"/>
-            </w:pPr>
-            <w:r/>
-            <w:r>
-              <w:rPr>
-                <w:rFonts w:ascii="Arial" w:hAnsi="Arial"/>
-                <w:sz w:val="18"/>
-              </w:rPr>
-              <w:t>soc2_gcp</w:t>
-            </w:r>
-          </w:p>
-        </w:tc>
-      </w:tr>
-      <w:tr>
-        <w:tc>
-          <w:tcPr>
-            <w:tcW w:type="dxa" w:w="4320"/>
-          </w:tcPr>
-          <w:p>
-            <w:pPr>
-              <w:spacing w:after="80"/>
-            </w:pPr>
-            <w:r/>
-            <w:r>
-              <w:rPr>
-                <w:rFonts w:ascii="Arial" w:hAnsi="Arial"/>
-                <w:sz w:val="18"/>
-              </w:rPr>
-              <w:t>ISO 27001:2022</w:t>
-            </w:r>
-          </w:p>
-        </w:tc>
-        <w:tc>
-          <w:tcPr>
-            <w:tcW w:type="dxa" w:w="4320"/>
-          </w:tcPr>
-          <w:p>
-            <w:pPr>
-              <w:spacing w:after="80"/>
-            </w:pPr>
-            <w:r/>
-            <w:r>
-              <w:rPr>
-                <w:rFonts w:ascii="Arial" w:hAnsi="Arial"/>
-                <w:sz w:val="18"/>
-              </w:rPr>
-              <w:t>iso27001_2022_gcp</w:t>
-            </w:r>
-          </w:p>
-        </w:tc>
-      </w:tr>
-    </w:tbl>
-    <w:p/>
-    <w:p>
-      <w:pPr>
-        <w:pStyle w:val="Heading1"/>
-      </w:pPr>
-      <w:r>
-        <w:rPr>
-          <w:rFonts w:ascii="Arial" w:hAnsi="Arial"/>
-          <w:b/>
-          <w:sz w:val="28"/>
-        </w:rPr>
-        <w:t>6. Outputs and Reports</w:t>
-      </w:r>
-    </w:p>
-    <w:p>
-      <w:pPr>
-        <w:spacing w:after="120"/>
-      </w:pPr>
-      <w:r>
-        <w:rPr>
-          <w:rFonts w:ascii="Arial" w:hAnsi="Arial"/>
-          <w:b w:val="0"/>
-          <w:i w:val="0"/>
-          <w:sz w:val="20"/>
-        </w:rPr>
-        <w:t>Prowler automatically saves the scan results in a directory called 'output' relative to where you ran the command.</w:t>
-      </w:r>
-    </w:p>
-    <w:p>
-      <w:pPr>
-        <w:spacing w:after="120"/>
-      </w:pPr>
-      <w:r>
-        <w:rPr>
-          <w:rFonts w:ascii="Arial" w:hAnsi="Arial"/>
-          <w:b w:val="0"/>
-          <w:i w:val="0"/>
-          <w:sz w:val="20"/>
-        </w:rPr>
-        <w:t>It generates three file formats by default:</w:t>
-      </w:r>
-    </w:p>
-    <w:p>
-      <w:pPr>
-        <w:pStyle w:val="ListBullet"/>
-        <w:spacing w:after="60"/>
-      </w:pPr>
-      <w:r>
-        <w:rPr>
-          <w:rFonts w:ascii="Arial" w:hAnsi="Arial"/>
-          <w:sz w:val="20"/>
-        </w:rPr>
-        <w:t>.html - Human-readable report dashboard</w:t>
-      </w:r>
-    </w:p>
-    <w:p>
-      <w:pPr>
-        <w:pStyle w:val="ListBullet"/>
-        <w:spacing w:after="60"/>
-      </w:pPr>
-      <w:r>
-        <w:rPr>
-          <w:rFonts w:ascii="Arial" w:hAnsi="Arial"/>
-          <w:sz w:val="20"/>
-        </w:rPr>
-        <w:t>.csv - Raw data for spreadsheets</w:t>
-      </w:r>
-    </w:p>
-    <w:p>
-      <w:pPr>
-        <w:pStyle w:val="ListBullet"/>
-        <w:spacing w:after="60"/>
-      </w:pPr>
-      <w:r>
-        <w:rPr>
-          <w:rFonts w:ascii="Arial" w:hAnsi="Arial"/>
-          <w:sz w:val="20"/>
-        </w:rPr>
-        <w:t>.json - Structured data for APIs or log managers</w:t>
-      </w:r>
-    </w:p>
-    <w:p>
-      <w:pPr>
-        <w:spacing w:after="120"/>
-      </w:pPr>
-      <w:r>
-        <w:rPr>
-          <w:rFonts w:ascii="Arial" w:hAnsi="Arial"/>
-          <w:b w:val="0"/>
-          <w:i w:val="0"/>
-          <w:sz w:val="20"/>
-        </w:rPr>
-        <w:t>To output reports to a specific folder, use the -o flag:</w:t>
-      </w:r>
-    </w:p>
-    <w:p>
-      <w:pPr>
-        <w:spacing w:before="80" w:after="80"/>
-        <w:ind w:left="360"/>
-      </w:pPr>
-      <w:r>
-        <w:rPr>
-          <w:rFonts w:ascii="Courier New" w:hAnsi="Courier New"/>
-          <w:sz w:val="18"/>
-        </w:rPr>
-        <w:t>prowler gcp -o ./my-gcp-audit-reports</w:t>
-      </w:r>
-    </w:p>
-    <w:p>
-      <w:pPr>
-        <w:pStyle w:val="Heading1"/>
-      </w:pPr>
-      <w:r>
-        <w:rPr>
-          <w:rFonts w:ascii="Arial" w:hAnsi="Arial"/>
-          <w:b/>
-          <w:sz w:val="28"/>
-        </w:rPr>
-        <w:t>7. Troubleshooting</w:t>
-      </w:r>
-    </w:p>
-    <w:p>
-      <w:pPr>
-        <w:pStyle w:val="ListBullet"/>
-        <w:spacing w:after="60"/>
-      </w:pPr>
-      <w:r>
-        <w:rPr>
-          <w:rFonts w:ascii="Arial" w:hAnsi="Arial"/>
-          <w:sz w:val="20"/>
-        </w:rPr>
-        <w:t>DefaultCredentialsError: Ensure GOOGLE_APPLICATION_CREDENTIALS points to the correct location of your JSON key file.</w:t>
-      </w:r>
-    </w:p>
-    <w:p>
-      <w:pPr>
-        <w:pStyle w:val="ListBullet"/>
-        <w:spacing w:after="60"/>
-      </w:pPr>
-      <w:r>
-        <w:rPr>
-          <w:rFonts w:ascii="Arial" w:hAnsi="Arial"/>
-          <w:sz w:val="20"/>
-        </w:rPr>
-        <w:t>403 Forbidden: Ensure the service account has been granted roles/viewer and roles/serviceusage.serviceUsageConsumer in the project.</w:t>
-      </w:r>
-    </w:p>
-    <w:p>
-      <w:pPr>
-        <w:pStyle w:val="ListBullet"/>
-        <w:spacing w:after="60"/>
-      </w:pPr>
-      <w:r>
-        <w:rPr>
-          <w:rFonts w:ascii="Arial" w:hAnsi="Arial"/>
-          <w:sz w:val="20"/>
-        </w:rPr>
-        <w:t>API not enabled: Enable the missing API using Cloud Console or gcloud cli.</w:t>
+        <w:t>Figure: Compliance dashboard detailing CIS standard posture ratios</w:t>
       </w:r>
     </w:p>
     <w:sectPr>

</xml_diff>